<commit_message>
Förklara fler förkortningar och facktermer
Genomgång efter oförklarade termer: SPC, CNC, CL/ÖSG/USG, kkr, fixtur
och skär saknade förklaring. Nu utskrivna vid första användning och
tillagda i ordlistan; CNC, ppm, kkr och PDCA skrivs även ut i
lärarhandledningen (GitHub + Word).

Co-Authored-By: Claude Fable 5 <noreply@anthropic.com>
</commit_message>
<xml_diff>
--- a/Lararhandledning SPC-laborationen.docx
+++ b/Lararhandledning SPC-laborationen.docx
@@ -386,7 +386,7 @@
         <w:t xml:space="preserve">Svenska Axel AB</w:t>
       </w:r>
       <w:r>
-        <w:t xml:space="preserve">, där CNC-svarven </w:t>
+        <w:t xml:space="preserve">, där CNC-svarven (Computer Numerical Control — datorstyrd verktygsmaskin) </w:t>
       </w:r>
       <w:r>
         <w:rPr>
@@ -538,7 +538,7 @@
         <w:t xml:space="preserve">förbättringsåtgärder</w:t>
       </w:r>
       <w:r>
-        <w:t xml:space="preserve"> utifrån hur variationskällor adderas kvadratiskt, och verifiera förbättringar med data (PDCA).</w:t>
+        <w:t xml:space="preserve"> utifrån hur variationskällor adderas kvadratiskt, och verifiera förbättringar med data (PDCA — Planera–Gör–Studera–Lär).</w:t>
       </w:r>
     </w:p>
     <w:p>
@@ -711,7 +711,7 @@
         <w:spacing w:after="160"/>
       </w:pPr>
       <w:r>
-        <w:t xml:space="preserve">Interaktiv normalfördelning där studenten drar i reglage för läge (μ) och spridning (σ) mot toleransgränserna och ser kassationen i ppm ändras live. Uppgiftskravet är att båda reglagen använts. Grundbegrepp: slumpmässiga/urskiljbara orsaker samt toleransgränser (kundens röst) kontra styrgränser (processens röst).</w:t>
+        <w:t xml:space="preserve">Interaktiv normalfördelning där studenten drar i reglage för läge (μ) och spridning (σ) mot toleransgränserna och ser kassationen i ppm (parts per million) ändras live. Uppgiftskravet är att båda reglagen använts. Grundbegrepp: slumpmässiga/urskiljbara orsaker samt toleransgränser (kundens röst) kontra styrgränser (processens röst).</w:t>
       </w:r>
     </w:p>
     <w:p>
@@ -908,7 +908,7 @@
         <w:spacing w:after="160"/>
       </w:pPr>
       <w:r>
-        <w:t xml:space="preserve">Studenten väljer förbättringsåtgärder inom en budget på 80 kkr och verifierar med en ny veckostudie. Mål: Cpk ≥ 1,33. Åtgärderna:</w:t>
+        <w:t xml:space="preserve">Studenten väljer förbättringsåtgärder inom en budget på 80 kkr (kilokronor = tusen kronor) och verifierar med en ny veckostudie. Mål: Cpk ≥ 1,33. Åtgärderna:</w:t>
       </w:r>
     </w:p>
     <w:tbl>

</xml_diff>